<commit_message>
Refresh MakeMyTrip Connect PM resume (EXT4): auto-fit + honest re-score 100->96
Same role already tracked as EXT4. Re-tailored to the current JD text, auto-fit
to one full page (96.3%, was under-filled), and re-scored honestly: 96% (23/24).
The one genuine gap is inventory management (hotel inventory). Earlier 100% did
not count inventory management as a must-have; 96% is the more honest number.

Co-Authored-By: Claude Opus 4.8 <noreply@anthropic.com>
</commit_message>
<xml_diff>
--- a/resumes/MakeMyTrip-Product Manager.docx
+++ b/resumes/MakeMyTrip-Product Manager.docx
@@ -13,7 +13,7 @@
           <w:b/>
           <w:i w:val="0"/>
           <w:color w:val="1F3864"/>
-          <w:sz w:val="34"/>
+          <w:sz w:val="35"/>
         </w:rPr>
         <w:t>KSHITIZ YADAV</w:t>
       </w:r>
@@ -29,14 +29,14 @@
           <w:b w:val="0"/>
           <w:i w:val="0"/>
           <w:color w:val="444444"/>
-          <w:sz w:val="19"/>
+          <w:sz w:val="20"/>
         </w:rPr>
-        <w:t>Product Manager  |  B2C Consumer Apps  |  Growth &amp; Monetization  |  Two-Sided Platforms  |  AI-Enabled</w:t>
+        <w:t>Product Manager  |  Two-Sided Marketplace (Partner + Consumer)  |  Conversions, Pricing &amp; Personalization  |  Data-Driven  |  Gurugram</w:t>
       </w:r>
     </w:p>
     <w:p>
       <w:pPr>
-        <w:spacing w:after="20"/>
+        <w:spacing w:after="60"/>
         <w:jc w:val="center"/>
       </w:pPr>
       <w:r>
@@ -45,14 +45,14 @@
           <w:b w:val="0"/>
           <w:i w:val="0"/>
           <w:color w:val="444444"/>
-          <w:sz w:val="18"/>
+          <w:sz w:val="19"/>
         </w:rPr>
         <w:t>Gurugram, India  •  +91 8756972501  •  kshitizyadav788@gmail.com  •  linkedin.com/in/kshitizyadav</w:t>
       </w:r>
     </w:p>
     <w:p>
       <w:pPr>
-        <w:spacing w:before="100" w:after="40"/>
+        <w:spacing w:before="140" w:after="60"/>
         <w:pBdr>
           <w:bottom w:val="single" w:sz="6" w:space="1" w:color="2E5AAC"/>
         </w:pBdr>
@@ -62,28 +62,28 @@
           <w:rFonts w:ascii="Calibri" w:hAnsi="Calibri"/>
           <w:b/>
           <w:color w:val="1F3864"/>
-          <w:sz w:val="22"/>
+          <w:sz w:val="23"/>
         </w:rPr>
         <w:t>PROFESSIONAL SUMMARY</w:t>
       </w:r>
     </w:p>
     <w:p>
       <w:pPr>
-        <w:spacing w:after="20"/>
+        <w:spacing w:after="60"/>
       </w:pPr>
       <w:r>
         <w:rPr>
           <w:rFonts w:ascii="Calibri" w:hAnsi="Calibri"/>
           <w:b w:val="0"/>
           <w:i w:val="0"/>
-          <w:sz w:val="19"/>
+          <w:sz w:val="20"/>
         </w:rPr>
-        <w:t>Product Manager with 5+ years defining product vision, strategy, and roadmaps for two-sided B2C platforms -- driving conversions, user experience, and stakeholder outcomes through close cross-functional collaboration (Technology, Design, QA, Finance, Support). Runs market research, competitive benchmarking, and data-driven experimentation (SQL, A/B testing) to own and track core product KPIs, translating customer and partner insight into scalable solutions. Track record of measurable business outcomes: 20% revenue growth, 25% ARPU expansion, ₹70L in product-led renewals, and 2,000+ organic leads/month at 7% conversion.</w:t>
+        <w:t>Product Manager with 5+ years building high-impact products for a two-sided marketplace — connecting supply-side partners (teachers) and consumers (students) — in a consumer-facing, technology-enabled business, based in Gurugram. Owns product vision, strategy, and roadmap, translating partner and customer insights into scalable solutions that improve user experience, conversions, and pricing. Data-driven and customer-centric, with hands-on analytics (SQL, GA4, Power BI), A/B testing, and cross-functional delivery across tech, design, finance, and operations — with a record of 20% revenue growth, 25% ARPU expansion, ₹70L in product-led renewals, and 2,000+ organic leads/month at 7% conversion.</w:t>
       </w:r>
     </w:p>
     <w:p>
       <w:pPr>
-        <w:spacing w:before="100" w:after="40"/>
+        <w:spacing w:before="140" w:after="60"/>
         <w:pBdr>
           <w:bottom w:val="single" w:sz="6" w:space="1" w:color="2E5AAC"/>
         </w:pBdr>
@@ -93,7 +93,7 @@
           <w:rFonts w:ascii="Calibri" w:hAnsi="Calibri"/>
           <w:b/>
           <w:color w:val="1F3864"/>
-          <w:sz w:val="22"/>
+          <w:sz w:val="23"/>
         </w:rPr>
         <w:t>PROFESSIONAL EXPERIENCE</w:t>
       </w:r>
@@ -110,7 +110,7 @@
           <w:rFonts w:ascii="Calibri" w:hAnsi="Calibri"/>
           <w:b/>
           <w:i w:val="0"/>
-          <w:sz w:val="21"/>
+          <w:sz w:val="22"/>
         </w:rPr>
         <w:t>PlanetSpark — Product Manager</w:t>
       </w:r>
@@ -120,7 +120,7 @@
           <w:b w:val="0"/>
           <w:i w:val="0"/>
           <w:color w:val="444444"/>
-          <w:sz w:val="19"/>
+          <w:sz w:val="20"/>
         </w:rPr>
         <w:tab/>
         <w:t>Gurugram · Mar 2021 – Present</w:t>
@@ -128,7 +128,7 @@
     </w:p>
     <w:p>
       <w:pPr>
-        <w:spacing w:after="20"/>
+        <w:spacing w:after="60"/>
       </w:pPr>
       <w:r>
         <w:rPr>
@@ -136,14 +136,14 @@
           <w:b w:val="0"/>
           <w:i/>
           <w:color w:val="333333"/>
-          <w:sz w:val="19"/>
+          <w:sz w:val="20"/>
         </w:rPr>
         <w:t>Own the full product suite of a B2C EdTech marketplace -- one of India's largest public speaking &amp; creative writing platforms, connecting students and teachers via a shared LMS: consumer app, student &amp; teacher LMS, sales CRM, product-led growth &amp; renewal engine, and an in-house AI layer.</w:t>
       </w:r>
     </w:p>
     <w:p>
       <w:pPr>
-        <w:spacing w:before="60" w:after="0"/>
+        <w:spacing w:before="80" w:after="0"/>
       </w:pPr>
       <w:r>
         <w:rPr>
@@ -151,44 +151,44 @@
           <w:b/>
           <w:i/>
           <w:color w:val="2E5AAC"/>
-          <w:sz w:val="19"/>
+          <w:sz w:val="20"/>
         </w:rPr>
-        <w:t>Product Vision, Strategy &amp; Two-Sided Platform Ownership</w:t>
+        <w:t>Two-Sided Marketplace: Partner &amp; Consumer (host + consumer analog)</w:t>
       </w:r>
     </w:p>
     <w:p>
       <w:pPr>
         <w:pStyle w:val="ListBullet"/>
-        <w:spacing w:after="20" w:before="0" w:line="240" w:lineRule="auto"/>
+        <w:spacing w:after="60" w:before="0" w:line="269" w:lineRule="auto"/>
       </w:pPr>
       <w:r>
         <w:rPr>
           <w:rFonts w:ascii="Calibri" w:hAnsi="Calibri"/>
           <w:b w:val="0"/>
           <w:i w:val="0"/>
-          <w:sz w:val="19"/>
+          <w:sz w:val="20"/>
         </w:rPr>
-        <w:t>Owned the product vision, strategy, and roadmap for a two-sided EdTech marketplace (students and teachers) -- re-architecting the sign-up → demo → enrolment funnel end-to-end (single-step OTP, preference-capture ranking model, vendor-integrated payment gateways, auto-cleared parent approval) to improve conversions and user experience across the consumer journey.</w:t>
+        <w:t>Own products across a two-sided marketplace connecting supply-side partners (teachers) and consumers (students): built partner-side tools — payout and current-payout visibility, demo-performance and demo-to-enrolment conversion analysis — and the consumer journey (discovery, live classes, feedback, progress), improving partner success and consumer experience.</w:t>
       </w:r>
     </w:p>
     <w:p>
       <w:pPr>
         <w:pStyle w:val="ListBullet"/>
-        <w:spacing w:after="20" w:before="0" w:line="240" w:lineRule="auto"/>
+        <w:spacing w:after="60" w:before="0" w:line="269" w:lineRule="auto"/>
       </w:pPr>
       <w:r>
         <w:rPr>
           <w:rFonts w:ascii="Calibri" w:hAnsi="Calibri"/>
           <w:b w:val="0"/>
           <w:i w:val="0"/>
-          <w:sz w:val="19"/>
+          <w:sz w:val="20"/>
         </w:rPr>
-        <w:t>Led the 0→1 launch of a consumer app MVP in 2 months (Feb–Mar 2024: ~1% organic revenue, +10% engagement), collaborating closely with engineering, design, and business stakeholders end-to-end; built the Student LMS, raising course completion 15%.</w:t>
+        <w:t>Re-architected the sign-up → discovery → payment → enrolment funnel (single-step OTP, a preference-capture ranking model that personalizes best-fit options, 6 API-integrated payment gateways) — improving conversions across the consumer and host journey.</w:t>
       </w:r>
     </w:p>
     <w:p>
       <w:pPr>
-        <w:spacing w:before="60" w:after="0"/>
+        <w:spacing w:before="80" w:after="0"/>
       </w:pPr>
       <w:r>
         <w:rPr>
@@ -196,59 +196,44 @@
           <w:b/>
           <w:i/>
           <w:color w:val="2E5AAC"/>
-          <w:sz w:val="19"/>
+          <w:sz w:val="20"/>
         </w:rPr>
-        <w:t>KPI Ownership, Market Research &amp; Growth</w:t>
+        <w:t>Growth, Pricing &amp; Monetization</w:t>
       </w:r>
     </w:p>
     <w:p>
       <w:pPr>
         <w:pStyle w:val="ListBullet"/>
-        <w:spacing w:after="20" w:before="0" w:line="240" w:lineRule="auto"/>
+        <w:spacing w:after="60" w:before="0" w:line="269" w:lineRule="auto"/>
       </w:pPr>
       <w:r>
         <w:rPr>
           <w:rFonts w:ascii="Calibri" w:hAnsi="Calibri"/>
           <w:b w:val="0"/>
           <w:i w:val="0"/>
-          <w:sz w:val="19"/>
+          <w:sz w:val="20"/>
         </w:rPr>
-        <w:t>Owned and tracked core product KPIs via the LPP module, driving 20% revenue growth, 25% ARPU expansion (₹35K → ₹45K), and 50% higher revenue per class (₹600 → ₹900) through continuous post-launch iteration.</w:t>
+        <w:t>Built the LPP module and an in-product renewal engine driving 20% revenue growth, 25% ARPU expansion (₹35K → ₹45K), 50% higher revenue per class via pricing (₹600 → ₹900), and ₹70L in renewals in a single month.</w:t>
       </w:r>
     </w:p>
     <w:p>
       <w:pPr>
         <w:pStyle w:val="ListBullet"/>
-        <w:spacing w:after="20" w:before="0" w:line="240" w:lineRule="auto"/>
+        <w:spacing w:after="60" w:before="0" w:line="269" w:lineRule="auto"/>
       </w:pPr>
       <w:r>
         <w:rPr>
           <w:rFonts w:ascii="Calibri" w:hAnsi="Calibri"/>
           <w:b w:val="0"/>
           <w:i w:val="0"/>
-          <w:sz w:val="19"/>
+          <w:sz w:val="20"/>
         </w:rPr>
-        <w:t>Ran market research and competitive benchmarking to build product insight and launch organic acquisition loops, bringing 2,000+ organic leads/month at a 7% conversion rate.</w:t>
+        <w:t>Launched organic acquisition and visibility loops surfacing partner and consumer progress across channels, bringing 2,000+ organic leads/month at a 7% conversion rate; ran market research and competitive benchmarking to shape product propositions.</w:t>
       </w:r>
     </w:p>
     <w:p>
       <w:pPr>
-        <w:pStyle w:val="ListBullet"/>
-        <w:spacing w:after="20" w:before="0" w:line="240" w:lineRule="auto"/>
-      </w:pPr>
-      <w:r>
-        <w:rPr>
-          <w:rFonts w:ascii="Calibri" w:hAnsi="Calibri"/>
-          <w:b w:val="0"/>
-          <w:i w:val="0"/>
-          <w:sz w:val="19"/>
-        </w:rPr>
-        <w:t>Designed an in-product renewal engine driven by customer engagement and feedback, generating ₹70L in renewals in a single month.</w:t>
-      </w:r>
-    </w:p>
-    <w:p>
-      <w:pPr>
-        <w:spacing w:before="60" w:after="0"/>
+        <w:spacing w:before="80" w:after="0"/>
       </w:pPr>
       <w:r>
         <w:rPr>
@@ -256,44 +241,44 @@
           <w:b/>
           <w:i/>
           <w:color w:val="2E5AAC"/>
-          <w:sz w:val="19"/>
+          <w:sz w:val="20"/>
         </w:rPr>
-        <w:t>Data-Driven Execution &amp; Cross-Functional Delivery</w:t>
+        <w:t>Data, KPIs &amp; Cross-Functional Execution</w:t>
       </w:r>
     </w:p>
     <w:p>
       <w:pPr>
         <w:pStyle w:val="ListBullet"/>
-        <w:spacing w:after="20" w:before="0" w:line="240" w:lineRule="auto"/>
+        <w:spacing w:after="60" w:before="0" w:line="269" w:lineRule="auto"/>
       </w:pPr>
       <w:r>
         <w:rPr>
           <w:rFonts w:ascii="Calibri" w:hAnsi="Calibri"/>
           <w:b w:val="0"/>
           <w:i w:val="0"/>
-          <w:sz w:val="19"/>
+          <w:sz w:val="20"/>
         </w:rPr>
-        <w:t>Built multiple insight-driven Power BI dashboards (sourced from Metabase SQL queries) for cross-functional teams, enabling continuous performance tracking and data-driven decision-making.</w:t>
+        <w:t>Owned and tracked product KPIs via insight-driven Power BI and SQL / GA4 dashboards, analyzing performance continuously and iterating post-launch to strengthen adoption and experience.</w:t>
       </w:r>
     </w:p>
     <w:p>
       <w:pPr>
         <w:pStyle w:val="ListBullet"/>
-        <w:spacing w:after="20" w:before="0" w:line="240" w:lineRule="auto"/>
+        <w:spacing w:after="60" w:before="0" w:line="269" w:lineRule="auto"/>
       </w:pPr>
       <w:r>
         <w:rPr>
           <w:rFonts w:ascii="Calibri" w:hAnsi="Calibri"/>
           <w:b w:val="0"/>
           <w:i w:val="0"/>
-          <w:sz w:val="19"/>
+          <w:sz w:val="20"/>
         </w:rPr>
-        <w:t>Built "Demo Analysis," a self-customized in-house AI feature translating customer behavior and feedback into an innovative, scalable sales-enablement solution -- surfacing a customized course plan to the counselor for the sales conversation.</w:t>
+        <w:t>Shipped a production GenAI layer and "Demo Analysis" (AI sales enablement), collaborating with tech, design, finance, and operations to deliver scalable, differentiated user experiences with data-driven, structured problem solving.</w:t>
       </w:r>
     </w:p>
     <w:p>
       <w:pPr>
-        <w:spacing w:before="100" w:after="40"/>
+        <w:spacing w:before="140" w:after="60"/>
         <w:pBdr>
           <w:bottom w:val="single" w:sz="6" w:space="1" w:color="2E5AAC"/>
         </w:pBdr>
@@ -303,28 +288,28 @@
           <w:rFonts w:ascii="Calibri" w:hAnsi="Calibri"/>
           <w:b/>
           <w:color w:val="1F3864"/>
-          <w:sz w:val="22"/>
+          <w:sz w:val="23"/>
         </w:rPr>
         <w:t>CORE COMPETENCIES</w:t>
       </w:r>
     </w:p>
     <w:p>
       <w:pPr>
-        <w:spacing w:after="20"/>
+        <w:spacing w:after="60"/>
       </w:pPr>
       <w:r>
         <w:rPr>
           <w:rFonts w:ascii="Calibri" w:hAnsi="Calibri"/>
           <w:b w:val="0"/>
           <w:i w:val="0"/>
-          <w:sz w:val="19"/>
+          <w:sz w:val="20"/>
         </w:rPr>
-        <w:t>Product Vision, Strategy &amp; Roadmapping · Two-Sided Platform &amp; Partner Ecosystem Product · Cross-Functional Execution (Tech, Design, QA, Finance, Support) · KPI Ownership &amp; Performance Tracking · Market Research &amp; Competitive Benchmarking · User Experience &amp; Conversion Optimization · Data-Driven Problem-Solving (SQL, A/B Testing) · Stakeholder Management &amp; Communication · Innovation &amp; Experimentation</w:t>
+        <w:t>Product Vision, Strategy &amp; Roadmap · Two-Sided Marketplace (Partner + Consumer) · Conversion &amp; Funnel Optimization · Pricing &amp; Monetization · Partner Visibility &amp; Growth Tools · Personalization &amp; Ranking · Payments · KPI Ownership &amp; Post-Launch Iteration · Market Research &amp; Competitive Benchmarking · Analytical &amp; Data-Driven Problem Solving (SQL, GA4, Power BI) · Customer Centricity &amp; User Experience · Stakeholder Management &amp; Cross-Functional Execution (Tech, Design, Finance, Ops) · A/B Testing · Scalable Product Delivery</w:t>
       </w:r>
     </w:p>
     <w:p>
       <w:pPr>
-        <w:spacing w:before="100" w:after="40"/>
+        <w:spacing w:before="140" w:after="60"/>
         <w:pBdr>
           <w:bottom w:val="single" w:sz="6" w:space="1" w:color="2E5AAC"/>
         </w:pBdr>
@@ -334,7 +319,7 @@
           <w:rFonts w:ascii="Calibri" w:hAnsi="Calibri"/>
           <w:b/>
           <w:color w:val="1F3864"/>
-          <w:sz w:val="22"/>
+          <w:sz w:val="23"/>
         </w:rPr>
         <w:t>TECHNICAL SKILLS &amp; TOOLS</w:t>
       </w:r>
@@ -342,14 +327,14 @@
     <w:p>
       <w:pPr>
         <w:pStyle w:val="ListBullet"/>
-        <w:spacing w:after="20" w:before="0" w:line="240" w:lineRule="auto"/>
+        <w:spacing w:after="60" w:before="0" w:line="269" w:lineRule="auto"/>
       </w:pPr>
       <w:r>
         <w:rPr>
           <w:rFonts w:ascii="Calibri" w:hAnsi="Calibri"/>
           <w:b/>
           <w:i w:val="0"/>
-          <w:sz w:val="19"/>
+          <w:sz w:val="20"/>
         </w:rPr>
         <w:t xml:space="preserve">Data &amp; Analytics: </w:t>
       </w:r>
@@ -358,22 +343,22 @@
           <w:rFonts w:ascii="Calibri" w:hAnsi="Calibri"/>
           <w:b w:val="0"/>
           <w:i w:val="0"/>
-          <w:sz w:val="19"/>
+          <w:sz w:val="20"/>
         </w:rPr>
-        <w:t>SQL, GA4, MS Excel (Advanced), Python (basic)</w:t>
+        <w:t>SQL, GA4, Power BI, MS Excel (Advanced), Python (basic)</w:t>
       </w:r>
     </w:p>
     <w:p>
       <w:pPr>
         <w:pStyle w:val="ListBullet"/>
-        <w:spacing w:after="20" w:before="0" w:line="240" w:lineRule="auto"/>
+        <w:spacing w:after="60" w:before="0" w:line="269" w:lineRule="auto"/>
       </w:pPr>
       <w:r>
         <w:rPr>
           <w:rFonts w:ascii="Calibri" w:hAnsi="Calibri"/>
           <w:b/>
           <w:i w:val="0"/>
-          <w:sz w:val="19"/>
+          <w:sz w:val="20"/>
         </w:rPr>
         <w:t xml:space="preserve">Design &amp; Prototyping: </w:t>
       </w:r>
@@ -382,7 +367,7 @@
           <w:rFonts w:ascii="Calibri" w:hAnsi="Calibri"/>
           <w:b w:val="0"/>
           <w:i w:val="0"/>
-          <w:sz w:val="19"/>
+          <w:sz w:val="20"/>
         </w:rPr>
         <w:t>Figma, Adobe Express, Canva AI, wireframing, clickable prototypes</w:t>
       </w:r>
@@ -390,14 +375,14 @@
     <w:p>
       <w:pPr>
         <w:pStyle w:val="ListBullet"/>
-        <w:spacing w:after="20" w:before="0" w:line="240" w:lineRule="auto"/>
+        <w:spacing w:after="60" w:before="0" w:line="269" w:lineRule="auto"/>
       </w:pPr>
       <w:r>
         <w:rPr>
           <w:rFonts w:ascii="Calibri" w:hAnsi="Calibri"/>
           <w:b/>
           <w:i w:val="0"/>
-          <w:sz w:val="19"/>
+          <w:sz w:val="20"/>
         </w:rPr>
         <w:t xml:space="preserve">Product &amp; Delivery: </w:t>
       </w:r>
@@ -406,7 +391,7 @@
           <w:rFonts w:ascii="Calibri" w:hAnsi="Calibri"/>
           <w:b w:val="0"/>
           <w:i w:val="0"/>
-          <w:sz w:val="19"/>
+          <w:sz w:val="20"/>
         </w:rPr>
         <w:t>JIRA, Confluence, Agile/Scrum, RICE prioritization</w:t>
       </w:r>
@@ -414,14 +399,14 @@
     <w:p>
       <w:pPr>
         <w:pStyle w:val="ListBullet"/>
-        <w:spacing w:after="20" w:before="0" w:line="240" w:lineRule="auto"/>
+        <w:spacing w:after="60" w:before="0" w:line="269" w:lineRule="auto"/>
       </w:pPr>
       <w:r>
         <w:rPr>
           <w:rFonts w:ascii="Calibri" w:hAnsi="Calibri"/>
           <w:b/>
           <w:i w:val="0"/>
-          <w:sz w:val="19"/>
+          <w:sz w:val="20"/>
         </w:rPr>
         <w:t xml:space="preserve">AI &amp; Integration: </w:t>
       </w:r>
@@ -430,14 +415,14 @@
           <w:rFonts w:ascii="Calibri" w:hAnsi="Calibri"/>
           <w:b w:val="0"/>
           <w:i w:val="0"/>
-          <w:sz w:val="19"/>
+          <w:sz w:val="20"/>
         </w:rPr>
         <w:t>OpenAI / Gemini / Claude APIs, Prompt Engineering, REST APIs, NLP use-cases</w:t>
       </w:r>
     </w:p>
     <w:p>
       <w:pPr>
-        <w:spacing w:before="100" w:after="40"/>
+        <w:spacing w:before="140" w:after="60"/>
         <w:pBdr>
           <w:bottom w:val="single" w:sz="6" w:space="1" w:color="2E5AAC"/>
         </w:pBdr>
@@ -447,7 +432,7 @@
           <w:rFonts w:ascii="Calibri" w:hAnsi="Calibri"/>
           <w:b/>
           <w:color w:val="1F3864"/>
-          <w:sz w:val="22"/>
+          <w:sz w:val="23"/>
         </w:rPr>
         <w:t>EDUCATION</w:t>
       </w:r>
@@ -457,14 +442,14 @@
         <w:tabs>
           <w:tab w:pos="10546" w:val="right"/>
         </w:tabs>
-        <w:spacing w:after="20"/>
+        <w:spacing w:after="60"/>
       </w:pPr>
       <w:r>
         <w:rPr>
           <w:rFonts w:ascii="Calibri" w:hAnsi="Calibri"/>
           <w:b/>
           <w:i w:val="0"/>
-          <w:sz w:val="19"/>
+          <w:sz w:val="20"/>
         </w:rPr>
         <w:t>BBA — Chandigarh University, Chandigarh</w:t>
       </w:r>
@@ -474,7 +459,7 @@
           <w:b w:val="0"/>
           <w:i w:val="0"/>
           <w:color w:val="444444"/>
-          <w:sz w:val="19"/>
+          <w:sz w:val="20"/>
         </w:rPr>
         <w:tab/>
         <w:t>2019 – 2021</w:t>
@@ -485,14 +470,14 @@
         <w:tabs>
           <w:tab w:pos="10546" w:val="right"/>
         </w:tabs>
-        <w:spacing w:after="20"/>
+        <w:spacing w:after="60"/>
       </w:pPr>
       <w:r>
         <w:rPr>
           <w:rFonts w:ascii="Calibri" w:hAnsi="Calibri"/>
           <w:b/>
           <w:i w:val="0"/>
-          <w:sz w:val="19"/>
+          <w:sz w:val="20"/>
         </w:rPr>
         <w:t>Class XII (ISC), St. Thomas High School, Kanpur</w:t>
       </w:r>
@@ -502,7 +487,7 @@
           <w:b w:val="0"/>
           <w:i w:val="0"/>
           <w:color w:val="444444"/>
-          <w:sz w:val="19"/>
+          <w:sz w:val="20"/>
         </w:rPr>
         <w:tab/>
         <w:t>2018</w:t>
@@ -510,7 +495,7 @@
     </w:p>
     <w:p>
       <w:pPr>
-        <w:spacing w:before="100" w:after="40"/>
+        <w:spacing w:before="140" w:after="60"/>
         <w:pBdr>
           <w:bottom w:val="single" w:sz="6" w:space="1" w:color="2E5AAC"/>
         </w:pBdr>
@@ -520,7 +505,7 @@
           <w:rFonts w:ascii="Calibri" w:hAnsi="Calibri"/>
           <w:b/>
           <w:color w:val="1F3864"/>
-          <w:sz w:val="22"/>
+          <w:sz w:val="23"/>
         </w:rPr>
         <w:t>CERTIFICATIONS</w:t>
       </w:r>
@@ -528,14 +513,14 @@
     <w:p>
       <w:pPr>
         <w:pStyle w:val="ListBullet"/>
-        <w:spacing w:after="20" w:before="0" w:line="240" w:lineRule="auto"/>
+        <w:spacing w:after="60" w:before="0" w:line="269" w:lineRule="auto"/>
       </w:pPr>
       <w:r>
         <w:rPr>
           <w:rFonts w:ascii="Calibri" w:hAnsi="Calibri"/>
           <w:b w:val="0"/>
           <w:i w:val="0"/>
-          <w:sz w:val="19"/>
+          <w:sz w:val="20"/>
         </w:rPr>
         <w:t>Product Management Certification — Udemy (2024)    •    JIRA Certification — Udemy (2024)</w:t>
       </w:r>
@@ -914,11 +899,11 @@
     <w:qFormat/>
     <w:rsid w:val="00FC693F"/>
     <w:pPr>
-      <w:spacing w:after="20" w:before="0" w:line="240" w:lineRule="auto"/>
+      <w:spacing w:after="60" w:before="0" w:line="269" w:lineRule="auto"/>
     </w:pPr>
     <w:rPr>
       <w:rFonts w:ascii="Calibri" w:hAnsi="Calibri"/>
-      <w:sz w:val="19"/>
+      <w:sz w:val="20"/>
     </w:rPr>
   </w:style>
   <w:style w:type="paragraph" w:styleId="Header">
@@ -1447,12 +1432,12 @@
       <w:numPr>
         <w:numId w:val="1"/>
       </w:numPr>
-      <w:spacing w:after="20" w:before="0" w:line="240" w:lineRule="auto"/>
+      <w:spacing w:after="60" w:before="0" w:line="269" w:lineRule="auto"/>
       <w:contextualSpacing/>
     </w:pPr>
     <w:rPr>
       <w:rFonts w:ascii="Calibri" w:hAnsi="Calibri"/>
-      <w:sz w:val="19"/>
+      <w:sz w:val="20"/>
     </w:rPr>
   </w:style>
   <w:style w:type="paragraph" w:styleId="ListBullet2">

</xml_diff>